<commit_message>
Made names more Hyboran
</commit_message>
<xml_diff>
--- a/Royal Court NPCs.docx
+++ b/Royal Court NPCs.docx
@@ -358,7 +358,7 @@
           <w:b/>
           <w:bCs/>
         </w:rPr>
-        <w:t>2.1 General Don Rodrigo de Valenza (Head of the Royal Army)</w:t>
+        <w:t>2.1 General Don Rodorigo de Valenza (Head of the Royal Army)</w:t>
       </w:r>
     </w:p>
     <w:p>
@@ -472,7 +472,7 @@
     </w:p>
     <w:p>
       <w:r>
-        <w:t>Outwardly, General Don Rodrigo presents himself as a stern, unyielding aristocratic protector of Zingara, a grandee of heavy cavalry (</w:t>
+        <w:t>Outwardly, General Don Rodorigo presents himself as a stern, unyielding aristocratic protector of Zingara, a grandee of heavy cavalry (</w:t>
       </w:r>
       <w:r>
         <w:rPr>
@@ -503,7 +503,7 @@
     <w:p>
       <w:r>
         <w:lastRenderedPageBreak/>
-        <w:t>General Don Rodrigo’s primary objective is to maintain absolute, unquestioned control over the Zingaran armed forces while keeping the Triumvirate completely dependent on his garrisons for physical survival. Furthermore, he harbors a deadly secret from Period VI: following the fall of the Church of Nemeth, he co-engineered the secret assassination of the primary republican leader during a victory conference and successfully framed the Church for the murder. If this conspiracy is exposed, it would reunite the republicans and shatter his authority.</w:t>
+        <w:t>General Don Rodorigo’s primary objective is to maintain absolute, unquestioned control over the Zingaran armed forces while keeping the Triumvirate completely dependent on his garrisons for physical survival. Furthermore, he harbors a deadly secret from Period VI: following the fall of the Church of Nemeth, he co-engineered the secret assassination of the primary republican leader during a victory conference and successfully framed the Church for the murder. If this conspiracy is exposed, it would reunite the republicans and shatter his authority.</w:t>
       </w:r>
     </w:p>
     <w:p>
@@ -523,7 +523,7 @@
     </w:p>
     <w:p>
       <w:r>
-        <w:t xml:space="preserve">Co-architect of the Restoration alongside High Chancellor Marquis Mateo de Sadoria. He harbors deep disdain for the provincial Grandees, viewing their petty feuds and obsession with </w:t>
+        <w:t xml:space="preserve">Co-architect of the Restoration alongside High Chancellor Marquis Murzio de Sadoria. He harbors deep disdain for the provincial Grandees, viewing their petty feuds and obsession with </w:t>
       </w:r>
       <w:r>
         <w:rPr>
@@ -581,7 +581,7 @@
         <w:t>Premise:</w:t>
       </w:r>
       <w:r>
-        <w:t xml:space="preserve"> General Don Rodrigo requests the Triumvirate sign an official royal decree mobilizing troops to purge a "rebel encampment" in the Zingg Valley. In reality, the camp houses surviving witnesses to the Period VI assassination of the republican founder.</w:t>
+        <w:t xml:space="preserve"> General Don Rodorigo requests the Triumvirate sign an official royal decree mobilizing troops to purge a "rebel encampment" in the Zingg Valley. In reality, the camp houses surviving witnesses to the Period VI assassination of the republican founder.</w:t>
       </w:r>
     </w:p>
     <w:p>
@@ -599,7 +599,7 @@
         <w:t>Core Conflict &amp; Player Choice:</w:t>
       </w:r>
       <w:r>
-        <w:t xml:space="preserve"> The PCs must decide whether to rubber-stamp the order to maintain Don Rodrigo’s favor, or delay the decree to dispatch covert agents (or personally travel to the Zingg Valley) to investigate who is actually in the camp.</w:t>
+        <w:t xml:space="preserve"> The PCs must decide whether to rubber-stamp the order to maintain Don Rodorigo’s favor, or delay the decree to dispatch covert agents (or personally travel to the Zingg Valley) to investigate who is actually in the camp.</w:t>
       </w:r>
     </w:p>
     <w:p>
@@ -655,7 +655,7 @@
         <w:t>Dynamic Escalation Trigger:</w:t>
       </w:r>
       <w:r>
-        <w:t xml:space="preserve"> If the PCs delay signing the decree for more than 24 hours, Don Rodrigo executes the operation using his private household guard, citing "emergency crown preservation," and places the PCs' royal quarters under protective lockdown.</w:t>
+        <w:t xml:space="preserve"> If the PCs delay signing the decree for more than 24 hours, Don Rodorigo executes the operation using his private household guard, citing "emergency crown preservation," and places the PCs' royal quarters under protective lockdown.</w:t>
       </w:r>
     </w:p>
     <w:p>
@@ -688,7 +688,7 @@
         <w:t>Premise:</w:t>
       </w:r>
       <w:r>
-        <w:t xml:space="preserve"> Republican agents in The Pit contact the PCs, claiming to possess written correspondence proving General Don Rodrigo ordered the Period VI political assassination.</w:t>
+        <w:t xml:space="preserve"> Republican agents in The Pit contact the PCs, claiming to possess written correspondence proving General Don Rodorigo ordered the Period VI political assassination.</w:t>
       </w:r>
     </w:p>
     <w:p>
@@ -706,7 +706,7 @@
         <w:t>Core Conflict &amp; Player Choice:</w:t>
       </w:r>
       <w:r>
-        <w:t xml:space="preserve"> The PCs must choose whether to buy the evidence using limited royal funds to gain blackmail leverage over their military handler, or alert Don Rodrigo to the cell's location to secure his immediate military loyalty against foreign raiders.</w:t>
+        <w:t xml:space="preserve"> The PCs must choose whether to buy the evidence using limited royal funds to gain blackmail leverage over their military handler, or alert Don Rodorigo to the cell's location to secure his immediate military loyalty against foreign raiders.</w:t>
       </w:r>
     </w:p>
     <w:p>
@@ -777,7 +777,7 @@
           <w:b/>
           <w:bCs/>
         </w:rPr>
-        <w:t>2.2 High Chancellor Marquis Mateo de Sadoria (Chief Monarchist)</w:t>
+        <w:t>2.2 High Chancellor Marquis Murzio de Sadoria (Chief Monarchist)</w:t>
       </w:r>
     </w:p>
     <w:p>
@@ -892,7 +892,7 @@
     </w:p>
     <w:p>
       <w:r>
-        <w:t>The Marquis Mateo portrays himself as an indefatigable statesman, a devoted monarchist, and a soft-spoken mentor to the young rulers. He manages state bureaucracy, court appointments, and treasury ledgers, constantly projecting an aura of dignified, bureaucratic order.</w:t>
+        <w:t>The Marquis Murzio portrays himself as an indefatigable statesman, a devoted monarchist, and a soft-spoken mentor to the young rulers. He manages state bureaucracy, court appointments, and treasury ledgers, constantly projecting an aura of dignified, bureaucratic order.</w:t>
       </w:r>
     </w:p>
     <w:p>
@@ -932,7 +932,7 @@
     </w:p>
     <w:p>
       <w:r>
-        <w:t>Firmly allied with General Don Rodrigo within the Restoration Council. He manipulates provincial grandees by adjusting central trade tariffs along the Thunder River at Jerida and the Black River at Kordava. He maintains a covert network of court informants and servants to keep the PCs under perpetual surveillance.</w:t>
+        <w:t>Firmly allied with General Don Rodorigo within the Restoration Council. He manipulates provincial grandees by adjusting central trade tariffs along the Thunder River at Jerida and the Black River at Kordava. He maintains a covert network of court informants and servants to keep the PCs under perpetual surveillance.</w:t>
       </w:r>
     </w:p>
     <w:p>
@@ -980,7 +980,7 @@
         <w:t>Premise:</w:t>
       </w:r>
       <w:r>
-        <w:t xml:space="preserve"> An economic crisis erupts as the royal household lacks funds to pay the Kordava city watch, threatening a municipal strike. Marquis Mateo refuses to release treasury funds unless the Triumvirate signs over crown mining rights in Guarralid to the Restoration Council.</w:t>
+        <w:t xml:space="preserve"> An economic crisis erupts as the royal household lacks funds to pay the Kordava city watch, threatening a municipal strike. Marquis Murzio refuses to release treasury funds unless the Triumvirate signs over crown mining rights in Guarralid to the Restoration Council.</w:t>
       </w:r>
     </w:p>
     <w:p>
@@ -998,7 +998,7 @@
         <w:t>Core Conflict &amp; Player Choice:</w:t>
       </w:r>
       <w:r>
-        <w:t xml:space="preserve"> The PCs must choose to capitulate to Marquis Mateo's economic extortion, or execute a covert subterranean heist into the ancient treasury vaults beneath the palace using secret passages in The Pit.</w:t>
+        <w:t xml:space="preserve"> The PCs must choose to capitulate to Marquis Murzio's economic extortion, or execute a covert subterranean heist into the ancient treasury vaults beneath the palace using secret passages in The Pit.</w:t>
       </w:r>
     </w:p>
     <w:p>
@@ -1088,7 +1088,7 @@
         <w:t>Premise:</w:t>
       </w:r>
       <w:r>
-        <w:t xml:space="preserve"> A trusted advisor or sole loyal blood relative of the PCs at court contracts a rare, slow-acting alchemical poison. Clues point directly to Marquis Mateo's personal physician—a subtle message to remind the Triumvirate how easily they can be replaced.</w:t>
+        <w:t xml:space="preserve"> A trusted advisor or sole loyal blood relative of the PCs at court contracts a rare, slow-acting alchemical poison. Clues point directly to Marquis Murzio's personal physician—a subtle message to remind the Triumvirate how easily they can be replaced.</w:t>
       </w:r>
     </w:p>
     <w:p>
@@ -1106,7 +1106,7 @@
         <w:t>Core Conflict &amp; Player Choice:</w:t>
       </w:r>
       <w:r>
-        <w:t xml:space="preserve"> The PCs must decide whether to publicly confront Marquis Mateo (risking an immediate palace coup without physical proof), or secretly dispatch an expedition to retrieve the legendary Fountain of Youth waters in the Rabirian Mountains to cure the victim.</w:t>
+        <w:t xml:space="preserve"> The PCs must decide whether to publicly confront Marquis Murzio (risking an immediate palace coup without physical proof), or secretly dispatch an expedition to retrieve the legendary Fountain of Youth waters in the Rabirian Mountains to cure the victim.</w:t>
       </w:r>
     </w:p>
     <w:p>
@@ -1192,7 +1192,7 @@
           <w:b/>
           <w:bCs/>
         </w:rPr>
-        <w:t>3.1 Fencing Master Lucia "La Mariposa" de la Vega (Republican Cell Commander)</w:t>
+        <w:t>3.1 Fencing Master Luzaia "The Mariposa" de Vegara (Republican Cell Commander)</w:t>
       </w:r>
     </w:p>
     <w:p>
@@ -1306,7 +1306,7 @@
     </w:p>
     <w:p>
       <w:r>
-        <w:t xml:space="preserve">Lucia operates publicly under the guise of a flamboyant fencing master running a prestigious </w:t>
+        <w:t xml:space="preserve">Luzaia operates publicly under the guise of a flamboyant fencing master running a prestigious </w:t>
       </w:r>
       <w:r>
         <w:rPr>
@@ -1418,7 +1418,7 @@
         <w:t>Premise:</w:t>
       </w:r>
       <w:r>
-        <w:t xml:space="preserve"> During a grand diplomatic gala hosted by the crown in Kordava, Lucia slips into the royal chambers undetected, offering physical proof of the Period VI assassination committed by General Don Rodrigo and Marquis Mateo.</w:t>
+        <w:t xml:space="preserve"> During a grand diplomatic gala hosted by the crown in Kordava, Luzaia slips into the royal chambers undetected, offering physical proof of the Period VI assassination committed by General Don Rodorigo and Marquis Murzio.</w:t>
       </w:r>
     </w:p>
     <w:p>
@@ -1436,7 +1436,7 @@
         <w:t>Core Conflict &amp; Player Choice:</w:t>
       </w:r>
       <w:r>
-        <w:t xml:space="preserve"> Lucia offers the evidence in exchange for royal pardons for her cell and binding constitutional concessions toward democracy. The PCs must choose to accept the bargain (risking open civil war with the Council), or turn her over to the royal guard to secure their handlers' trust.</w:t>
+        <w:t xml:space="preserve"> Luzaia offers the evidence in exchange for royal pardons for her cell and binding constitutional concessions toward democracy. The PCs must choose to accept the bargain (risking open civil war with the Council), or turn her over to the royal guard to secure their handlers' trust.</w:t>
       </w:r>
     </w:p>
     <w:p>
@@ -1543,7 +1543,7 @@
         <w:t>Core Conflict &amp; Player Choice:</w:t>
       </w:r>
       <w:r>
-        <w:t xml:space="preserve"> The PCs must choose whether to lead a military assault to execute the insurgents and re-enslave the thralls, or negotiate a secret treaty with Lucia to convert the mine into a free labor commune in exchange for a cut of iron delivered directly to the crown.</w:t>
+        <w:t xml:space="preserve"> The PCs must choose whether to lead a military assault to execute the insurgents and re-enslave the thralls, or negotiate a secret treaty with Luzaia to convert the mine into a free labor commune in exchange for a cut of iron delivered directly to the crown.</w:t>
       </w:r>
     </w:p>
     <w:p>
@@ -1779,7 +1779,7 @@
     </w:p>
     <w:p>
       <w:r>
-        <w:t>Harbors a fanatical hatred for the Restoration Council and General Don Rodrigo. He views republican agitators as godless Heretics, but is willing to offer the PC Triumvirate holy protection and divine magic against dark sorcery if they turn away from necromantic exploitation.</w:t>
+        <w:t>Harbors a fanatical hatred for the Restoration Council and General Don Rodorigo. He views republican agitators as godless Heretics, but is willing to offer the PC Triumvirate holy protection and divine magic against dark sorcery if they turn away from necromantic exploitation.</w:t>
       </w:r>
     </w:p>
     <w:p>
@@ -2039,7 +2039,7 @@
           <w:b/>
           <w:bCs/>
         </w:rPr>
-        <w:t>4.1 High Duke Gonzalo de Guarralid (Grandee Representative)</w:t>
+        <w:t>4.1 High Duke Gonzalgo de Guarralid (Grandee Representative)</w:t>
       </w:r>
     </w:p>
     <w:p>
@@ -2193,7 +2193,7 @@
     </w:p>
     <w:p>
       <w:r>
-        <w:t>Gonzalo aims to weaken central crown tariffs along interior river routes at Jerida, expand his mountain fief's private borders into Sadoria, hoard mineral wealth from local iron and tin mines, and test the martial resolve of the untested Triumvirate.</w:t>
+        <w:t>Gonzalgo aims to weaken central crown tariffs along interior river routes at Jerida, expand his mountain fief's private borders into Sadoria, hoard mineral wealth from local iron and tin mines, and test the martial resolve of the untested Triumvirate.</w:t>
       </w:r>
     </w:p>
     <w:p>
@@ -2261,7 +2261,7 @@
         <w:t>Premise:</w:t>
       </w:r>
       <w:r>
-        <w:t xml:space="preserve"> During a formal court reception in Kordava, High Duke Gonzalo publicly insults the martial capability of the Triumvirate, demanding one of the PC rulers (or their chosen champion) settle a border tariff dispute via a formal duel at dawn.</w:t>
+        <w:t xml:space="preserve"> During a formal court reception in Kordava, High Duke Gonzalgo publicly insults the martial capability of the Triumvirate, demanding one of the PC rulers (or their chosen champion) settle a border tariff dispute via a formal duel at dawn.</w:t>
       </w:r>
     </w:p>
     <w:p>
@@ -2359,7 +2359,7 @@
         <w:t>Dynamic Escalation Trigger:</w:t>
       </w:r>
       <w:r>
-        <w:t xml:space="preserve"> If the PC wins the duel, Gonzalo's hot-headed son immediately mobilizes three squadrons of heavy cavalry along the royal border, threatening open civil war unless compensated.</w:t>
+        <w:t xml:space="preserve"> If the PC wins the duel, Gonzalgo's hot-headed son immediately mobilizes three squadrons of heavy cavalry along the royal border, threatening open civil war unless compensated.</w:t>
       </w:r>
     </w:p>
     <w:p>
@@ -2392,7 +2392,7 @@
         <w:t>Premise:</w:t>
       </w:r>
       <w:r>
-        <w:t xml:space="preserve"> Gonzalo instructs his river inspectors in Jerida to seize all crown timber and iron barges, refusing to pay royal transit tariffs along the lower Thunder River until the central court lowers tax rates across the provinces.</w:t>
+        <w:t xml:space="preserve"> Gonzalgo instructs his river inspectors in Jerida to seize all crown timber and iron barges, refusing to pay royal transit tariffs along the lower Thunder River until the central court lowers tax rates across the provinces.</w:t>
       </w:r>
     </w:p>
     <w:p>
@@ -2410,7 +2410,7 @@
         <w:t>Core Conflict &amp; Player Choice:</w:t>
       </w:r>
       <w:r>
-        <w:t xml:space="preserve"> The PCs can choose to send the royal army to break the blockade by force (playing directly into General Don Rodrigo's hands), or personally travel to Jerida to mediate a deal or organize a privateer strike against the Duke's river forts.</w:t>
+        <w:t xml:space="preserve"> The PCs can choose to send the royal army to break the blockade by force (playing directly into General Don Rodorigo's hands), or personally travel to Jerida to mediate a deal or organize a privateer strike against the Duke's river forts.</w:t>
       </w:r>
     </w:p>
     <w:p>
@@ -2702,7 +2702,7 @@
         <w:t>Core Conflict &amp; Player Choice:</w:t>
       </w:r>
       <w:r>
-        <w:t xml:space="preserve"> The mausoleum is guarded by the Final Guard: one thousand elite ancient warriors transformed into deathless, animate stone. The PCs must decide whether to lead a covert expedition to retrieve pre-Cataclysmic war relics to arm a personal guard independent of General Don Rodrigo, or arrest Vesper for trafficking state antiquities.</w:t>
+        <w:t xml:space="preserve"> The mausoleum is guarded by the Final Guard: one thousand elite ancient warriors transformed into deathless, animate stone. The PCs must decide whether to lead a covert expedition to retrieve pre-Cataclysmic war relics to arm a personal guard independent of General Don Rodorigo, or arrest Vesper for trafficking state antiquities.</w:t>
       </w:r>
     </w:p>
     <w:p>
@@ -2791,7 +2791,7 @@
         <w:t>Premise:</w:t>
       </w:r>
       <w:r>
-        <w:t xml:space="preserve"> Vesper acquires the private financial ledgers of Marquis Mateo, proving the Council has been secretly funneling state gold into private offshore accounts in the Barachan Isles.</w:t>
+        <w:t xml:space="preserve"> Vesper acquires the private financial ledgers of Marquis Murzio, proving the Council has been secretly funneling state gold into private offshore accounts in the Barachan Isles.</w:t>
       </w:r>
     </w:p>
     <w:p>
@@ -3274,7 +3274,7 @@
         <w:t>Core Conflict &amp; Player Choice:</w:t>
       </w:r>
       <w:r>
-        <w:t xml:space="preserve"> The PCs must decide whether to approve this dark necromantic project to gain immediate military independence from General Don Rodrigo, or execute Vane to end state-sponsored necromancy.</w:t>
+        <w:t xml:space="preserve"> The PCs must decide whether to approve this dark necromantic project to gain immediate military independence from General Don Rodorigo, or execute Vane to end state-sponsored necromancy.</w:t>
       </w:r>
     </w:p>
     <w:p>
@@ -3892,7 +3892,7 @@
                 <w:b/>
                 <w:bCs/>
               </w:rPr>
-              <w:t>General Don Rodrigo de Valenza</w:t>
+              <w:t>General Don Rodorigo de Valenza</w:t>
             </w:r>
             <w:r>
               <w:t xml:space="preserve"> </w:t>
@@ -3974,7 +3974,7 @@
           </w:tcPr>
           <w:p>
             <w:r>
-              <w:t>Fencing Master Lucia "La Mariposa" de la Vega</w:t>
+              <w:t>Fencing Master Luzaia "The Mariposa" de Vegara</w:t>
             </w:r>
           </w:p>
         </w:tc>
@@ -3998,7 +3998,7 @@
                 <w:b/>
                 <w:bCs/>
               </w:rPr>
-              <w:t>High Chancellor Marquis Mateo de Sadoria</w:t>
+              <w:t>High Chancellor Marquis Murzio de Sadoria</w:t>
             </w:r>
             <w:r>
               <w:t xml:space="preserve"> </w:t>
@@ -4085,7 +4085,7 @@
           <w:p>
             <w:r>
               <w:lastRenderedPageBreak/>
-              <w:t>High Duke Gonzalo de Guarralid</w:t>
+              <w:t>High Duke Gonzalgo de Guarralid</w:t>
             </w:r>
           </w:p>
         </w:tc>
@@ -4109,7 +4109,7 @@
                 <w:b/>
                 <w:bCs/>
               </w:rPr>
-              <w:t>Fencing Master Lucia "La Mariposa" de la Vega</w:t>
+              <w:t>Fencing Master Luzaia "The Mariposa" de Vegara</w:t>
             </w:r>
             <w:r>
               <w:t xml:space="preserve"> </w:t>
@@ -4198,7 +4198,7 @@
           </w:tcPr>
           <w:p>
             <w:r>
-              <w:t>General Don Rodrigo de Valenza</w:t>
+              <w:t>General Don Rodorigo de Valenza</w:t>
             </w:r>
           </w:p>
         </w:tc>
@@ -4328,7 +4328,7 @@
                 <w:b/>
                 <w:bCs/>
               </w:rPr>
-              <w:t>High Duke Gonzalo de Guarralid</w:t>
+              <w:t>High Duke Gonzalgo de Guarralid</w:t>
             </w:r>
             <w:r>
               <w:t xml:space="preserve"> </w:t>
@@ -4427,7 +4427,7 @@
           </w:tcPr>
           <w:p>
             <w:r>
-              <w:t>High Chancellor Marquis Mateo de Sadoria</w:t>
+              <w:t>High Chancellor Marquis Murzio de Sadoria</w:t>
             </w:r>
           </w:p>
         </w:tc>
@@ -4533,7 +4533,7 @@
           </w:tcPr>
           <w:p>
             <w:r>
-              <w:t>General Don Rodrigo de Valenza</w:t>
+              <w:t>General Don Rodorigo de Valenza</w:t>
             </w:r>
           </w:p>
         </w:tc>
@@ -4868,7 +4868,7 @@
         <w:t>Strategic Reward:</w:t>
       </w:r>
       <w:r>
-        <w:t xml:space="preserve"> Secures absolute blackmail evidence against General Don Rodrigo and Marquis Mateo, allowing the PCs to purge their puppetmasters or force total political submission.</w:t>
+        <w:t xml:space="preserve"> Secures absolute blackmail evidence against General Don Rodorigo and Marquis Murzio, allowing the PCs to purge their puppetmasters or force total political submission.</w:t>
       </w:r>
     </w:p>
     <w:p>

</xml_diff>